<commit_message>
Add launch content pack and book contact email
- launch-content.md: ready-to-send launch email to past guests, review-nudge
  email, Instagram/Facebook/Story/WhatsApp posts, and website blurb, all using
  Cappadociatravels50@gmail.com as contact, with an Amazon-policy safety note on
  reviews and a run-of-show
- manuscript back matter now points readers to Cappadociatravels50@gmail.com;
  rebuilt Cappadocia-Travel-Guide.docx accordingly

Co-Authored-By: Claude Opus 4.8 <noreply@anthropic.com>
Claude-Session: https://claude.ai/code/session_01Kyesx3Zr1zJ2TVPNSgfiP5
</commit_message>
<xml_diff>
--- a/kdp-ebook/Cappadocia-Travel-Guide.docx
+++ b/kdp-ebook/Cappadocia-Travel-Guide.docx
@@ -3611,6 +3611,18 @@
           <w:iCs/>
         </w:rPr>
         <w:t xml:space="preserve">Planning your stay? Look for a cave hotel that books you direct, arranges your transfer, and sorts your balloon flight with an operator it trusts — it's the easiest way to travel Cappadocia well.</w:t>
+      </w:r>
+    </w:p>
+    <w:p>
+      <w:pPr>
+        <w:spacing w:after="160"/>
+      </w:pPr>
+      <w:r>
+        <w:rPr>
+          <w:b/>
+          <w:bCs/>
+        </w:rPr>
+        <w:t xml:space="preserve">Questions, or planning your trip? Write to us at Cappadociatravels50@gmail.com — a real person who lives here will answer.</w:t>
       </w:r>
     </w:p>
     <w:sectPr>

</xml_diff>